<commit_message>
feat(backup): implement backup download functionality with authorization
</commit_message>
<xml_diff>
--- a/HR_System_Feature_Documentation.docx
+++ b/HR_System_Feature_Documentation.docx
@@ -228,6 +228,14 @@
       </w:pPr>
       <w:r>
         <w:t>20. Audit Logs</w:t>
+      </w:r>
+    </w:p>
+    <w:p>
+      <w:pPr>
+        <w:pStyle w:val="ListNumber"/>
+      </w:pPr>
+      <w:r>
+        <w:t>21. Manual Backup</w:t>
       </w:r>
     </w:p>
     <w:p>
@@ -11113,6 +11121,281 @@
         <w:t>Sensitive data such as passwords and tokens are never included in audit log entries.</w:t>
       </w:r>
     </w:p>
+    <w:p>
+      <w:pPr>
+        <w:pStyle w:val="Heading1"/>
+      </w:pPr>
+      <w:r>
+        <w:t>21. Manual Backup</w:t>
+      </w:r>
+    </w:p>
+    <w:p>
+      <w:r>
+        <w:t>Admin users can manually download a full database backup (SQL dump) directly from the system. This provides a safety net before risky operations such as bulk imports, payroll generation, or system upgrades — without requiring direct server access.</w:t>
+      </w:r>
+    </w:p>
+    <w:p>
+      <w:pPr>
+        <w:pStyle w:val="Heading2"/>
+      </w:pPr>
+      <w:r>
+        <w:t>Features</w:t>
+      </w:r>
+    </w:p>
+    <w:p>
+      <w:pPr>
+        <w:pStyle w:val="ListBullet"/>
+      </w:pPr>
+      <w:r>
+        <w:t>Download a complete database backup as a .sql file</w:t>
+      </w:r>
+    </w:p>
+    <w:p>
+      <w:pPr>
+        <w:pStyle w:val="ListBullet"/>
+      </w:pPr>
+      <w:r>
+        <w:t>Supports PostgreSQL and MySQL databases</w:t>
+      </w:r>
+    </w:p>
+    <w:p>
+      <w:pPr>
+        <w:pStyle w:val="ListBullet"/>
+      </w:pPr>
+      <w:r>
+        <w:t>Backup is generated on-demand (not stored on the server)</w:t>
+      </w:r>
+    </w:p>
+    <w:p>
+      <w:pPr>
+        <w:pStyle w:val="ListBullet"/>
+      </w:pPr>
+      <w:r>
+        <w:t>File is automatically deleted after download completes</w:t>
+      </w:r>
+    </w:p>
+    <w:p>
+      <w:pPr>
+        <w:pStyle w:val="ListBullet"/>
+      </w:pPr>
+      <w:r>
+        <w:t>Action is recorded in the audit log</w:t>
+      </w:r>
+    </w:p>
+    <w:p>
+      <w:pPr>
+        <w:pStyle w:val="ListBullet"/>
+      </w:pPr>
+      <w:r>
+        <w:t>Only accessible to Admin users</w:t>
+      </w:r>
+    </w:p>
+    <w:p>
+      <w:pPr>
+        <w:pStyle w:val="Heading2"/>
+      </w:pPr>
+      <w:r>
+        <w:t>How It Works</w:t>
+      </w:r>
+    </w:p>
+    <w:p>
+      <w:pPr>
+        <w:pStyle w:val="ListNumber"/>
+      </w:pPr>
+      <w:r>
+        <w:t>1. Admin clicks "Download Backup" in the system settings or admin panel</w:t>
+      </w:r>
+    </w:p>
+    <w:p>
+      <w:pPr>
+        <w:pStyle w:val="ListNumber"/>
+      </w:pPr>
+      <w:r>
+        <w:t>2. The system generates a database dump (this may take a few seconds for large databases)</w:t>
+      </w:r>
+    </w:p>
+    <w:p>
+      <w:pPr>
+        <w:pStyle w:val="ListNumber"/>
+      </w:pPr>
+      <w:r>
+        <w:t>3. The .sql file is streamed as a download to the admin's browser</w:t>
+      </w:r>
+    </w:p>
+    <w:p>
+      <w:pPr>
+        <w:pStyle w:val="ListNumber"/>
+      </w:pPr>
+      <w:r>
+        <w:t>4. The temporary file is removed from the server immediately after download</w:t>
+      </w:r>
+    </w:p>
+    <w:p>
+      <w:pPr>
+        <w:pStyle w:val="Heading2"/>
+      </w:pPr>
+      <w:r>
+        <w:t>Backup File</w:t>
+      </w:r>
+    </w:p>
+    <w:p>
+      <w:pPr>
+        <w:pStyle w:val="ListBullet"/>
+      </w:pPr>
+      <w:r>
+        <w:t>Format: Plain SQL (.sql)</w:t>
+      </w:r>
+    </w:p>
+    <w:p>
+      <w:pPr>
+        <w:pStyle w:val="ListBullet"/>
+      </w:pPr>
+      <w:r>
+        <w:t>Filename pattern: db-backup-YYYY-MM-DD_HHMMSS.sql</w:t>
+      </w:r>
+    </w:p>
+    <w:p>
+      <w:pPr>
+        <w:pStyle w:val="ListBullet"/>
+      </w:pPr>
+      <w:r>
+        <w:t>Contains: Full database schema and data</w:t>
+      </w:r>
+    </w:p>
+    <w:p>
+      <w:pPr>
+        <w:pStyle w:val="ListBullet"/>
+      </w:pPr>
+      <w:r>
+        <w:t>Timeout: 120 seconds maximum generation time</w:t>
+      </w:r>
+    </w:p>
+    <w:p>
+      <w:pPr>
+        <w:pStyle w:val="Heading2"/>
+      </w:pPr>
+      <w:r>
+        <w:t>Access Control</w:t>
+      </w:r>
+    </w:p>
+    <w:tbl>
+      <w:tblPr>
+        <w:tblStyle w:val="TableGrid"/>
+        <w:tblW w:type="auto" w:w="0"/>
+        <w:tblLook w:firstColumn="1" w:firstRow="1" w:lastColumn="0" w:lastRow="0" w:noHBand="0" w:noVBand="1" w:val="04A0"/>
+      </w:tblPr>
+      <w:tblGrid>
+        <w:gridCol w:w="1728"/>
+        <w:gridCol w:w="1728"/>
+        <w:gridCol w:w="1728"/>
+        <w:gridCol w:w="1728"/>
+        <w:gridCol w:w="1728"/>
+      </w:tblGrid>
+      <w:tr>
+        <w:tc>
+          <w:tcPr>
+            <w:tcW w:type="dxa" w:w="1728"/>
+          </w:tcPr>
+          <w:p>
+            <w:r>
+              <w:t>Feature</w:t>
+            </w:r>
+          </w:p>
+        </w:tc>
+        <w:tc>
+          <w:tcPr>
+            <w:tcW w:type="dxa" w:w="1728"/>
+          </w:tcPr>
+          <w:p>
+            <w:r>
+              <w:t>Admin</w:t>
+            </w:r>
+          </w:p>
+        </w:tc>
+        <w:tc>
+          <w:tcPr>
+            <w:tcW w:type="dxa" w:w="1728"/>
+          </w:tcPr>
+          <w:p>
+            <w:r>
+              <w:t>HR</w:t>
+            </w:r>
+          </w:p>
+        </w:tc>
+        <w:tc>
+          <w:tcPr>
+            <w:tcW w:type="dxa" w:w="1728"/>
+          </w:tcPr>
+          <w:p>
+            <w:r>
+              <w:t>CEO</w:t>
+            </w:r>
+          </w:p>
+        </w:tc>
+        <w:tc>
+          <w:tcPr>
+            <w:tcW w:type="dxa" w:w="1728"/>
+          </w:tcPr>
+          <w:p>
+            <w:r>
+              <w:t>Employee</w:t>
+            </w:r>
+          </w:p>
+        </w:tc>
+      </w:tr>
+      <w:tr>
+        <w:tc>
+          <w:tcPr>
+            <w:tcW w:type="dxa" w:w="1728"/>
+          </w:tcPr>
+          <w:p>
+            <w:r>
+              <w:t>Download backup</w:t>
+            </w:r>
+          </w:p>
+        </w:tc>
+        <w:tc>
+          <w:tcPr>
+            <w:tcW w:type="dxa" w:w="1728"/>
+          </w:tcPr>
+          <w:p>
+            <w:r>
+              <w:t>Yes</w:t>
+            </w:r>
+          </w:p>
+        </w:tc>
+        <w:tc>
+          <w:tcPr>
+            <w:tcW w:type="dxa" w:w="1728"/>
+          </w:tcPr>
+          <w:p>
+            <w:r>
+              <w:t>No</w:t>
+            </w:r>
+          </w:p>
+        </w:tc>
+        <w:tc>
+          <w:tcPr>
+            <w:tcW w:type="dxa" w:w="1728"/>
+          </w:tcPr>
+          <w:p>
+            <w:r>
+              <w:t>No</w:t>
+            </w:r>
+          </w:p>
+        </w:tc>
+        <w:tc>
+          <w:tcPr>
+            <w:tcW w:type="dxa" w:w="1728"/>
+          </w:tcPr>
+          <w:p>
+            <w:r>
+              <w:t>No</w:t>
+            </w:r>
+          </w:p>
+        </w:tc>
+      </w:tr>
+    </w:tbl>
     <w:sectPr>
       <w:pgSz w:w="12240" w:h="15840"/>
       <w:pgMar w:top="1440" w:right="1800" w:bottom="1440" w:left="1800" w:header="720" w:footer="720" w:gutter="0"/>

</xml_diff>